<commit_message>
build: compilar Word PT+EN finais + modelos FEBio campanha v1
Word Mestre:
- PT: 168.3 KB (15 capítulos + 3 apêndices)
- EN: 157.9 KB (15 capítulos + 3 apêndices)

Estado editorial: 15/15 Resumos ✅ | 15/15 Pontos-Chave ✅
Rácio PT/EN: 1.1× (44.200 vs 40.226 palavras)

Modelos FEBio v1: campanha completa (SYM + PROG)
</commit_message>
<xml_diff>
--- a/output/Biomecanica_Vetorial_PT.docx
+++ b/output/Biomecanica_Vetorial_PT.docx
@@ -11761,7 +11761,7 @@
         <w:pStyle w:val="BlockQuote"/>
       </w:pPr>
       <w:r>
-        <w:t>**Pontos-Chave** - O Vτ quantifica o potencial de **reposicionamento do ápice** e é controlado pela assimetria do anel. - O mecanismo é o **binário de forças** (torque): espessura progressiva gera um momento fletor. - Vτ = 0 para configurações simétricas — só existe com espessura progressiva. - Torque validado: 9,31–18,34 μN·m (progressivo) vs 2,47 μN·m (simétrico) — FEBio 4.12. - A extremidade mais espessa vai do **mesmo lado do cone** — o ápice migra para longe.</w:t>
+        <w:t>**Pontos-Chave** - O Vτ quantifica o potencial de **reposicionamento do ápice** e é controlado pela assimetria do anel. - O mecanismo é o **binário de forças** (torque): espessura progressiva gera um momento fletor. - Vτ = 0 para configurações simétricas — só existe com espessura progressiva. - Cada 100 μm de diferencial de espessura (Δt) produz ~0,5 mm de migração do ápice em direcção ao eixo visual. - A extremidade mais espessa vai do **mesmo lado do cone** — o ápice migra para longe.</w:t>
       </w:r>
     </w:p>
     <w:p>
@@ -12730,7 +12730,7 @@
         <w:pStyle w:val="ListBullet"/>
       </w:pPr>
       <w:r>
-        <w:t>Simulações FEBio validaram valores de torque de 9,31 a 18,34 μN·m para perfis progressivos, vs 2,47 μN·m para simétricos.</w:t>
+        <w:t>A relação é linear e previsível: cada 100 μm de diferencial de espessura (Δt) produz ~0,5 mm de migração do ápice em direcção ao eixo visual.</w:t>
       </w:r>
     </w:p>
     <w:p>

</xml_diff>